<commit_message>
Actualizar checklist: arquitectura integrada, resumen de cumplimiento para 7-sep
</commit_message>
<xml_diff>
--- a/checklist-cierre-propuesta-eci.docx
+++ b/checklist-cierre-propuesta-eci.docx
@@ -50,21 +50,162 @@
           <w:color w:val="42506B"/>
           <w:sz w:val="19"/>
         </w:rPr>
-        <w:t>Diagnóstico generado a partir del expediente completo (TdR, anexos, RUT, estados financieros, cotizaciones Cydesys) — 4 de septiembre de 2026. Fecha límite de radicación: 16 de septiembre de 2026, 12:00 pm.</w:t>
+        <w:t>Actualizado el 5 de septiembre de 2026, tras integrar la arquitectura Sangfor + Cydesys (HPE) en la presentación técnica final. Fecha límite de envío de la propuesta técnica: 7 de septiembre de 2026, 12:00 pm.</w:t>
       </w:r>
     </w:p>
     <w:p/>
     <w:p>
+      <w:pPr>
+        <w:pStyle w:val="Heading1"/>
+      </w:pPr>
       <w:r>
         <w:rPr>
           <w:b/>
-          <w:color w:val="A32F2F"/>
-          <w:sz w:val="20"/>
+          <w:color w:val="08387F"/>
+          <w:sz w:val="30"/>
         </w:rPr>
-        <w:t>DIAGNÓSTICO GENERAL: el expediente jurídico, financiero y de experiencia está incompleto frente a los requisitos obligatorios de habilitación del TdR. La arquitectura técnica y las cotizaciones de hardware (Cydesys) SÍ están resueltas — el riesgo real de descalificación está en la documentación legal, financiera y de garantías, no en la parte técnica.</w:t>
+        <w:t>Cumplimiento para la entrega del 7 de septiembre</w:t>
       </w:r>
     </w:p>
+    <w:p>
+      <w:r>
+        <w:rPr>
+          <w:i w:val="0"/>
+          <w:color w:val="42506B"/>
+          <w:sz w:val="19"/>
+        </w:rPr>
+        <w:t>El TdR exige para esta fecha el envío de la “propuesta técnica (arquitectura y modelo ofertado)”. Ese componente está resuelto. El riesgo real está en si el TdR también exige los habilitantes jurídicos/financieros junto con la técnica — validar esto es la primera acción del día.</w:t>
+      </w:r>
+    </w:p>
+    <w:tbl>
+      <w:tblPr>
+        <w:tblW w:type="auto" w:w="0"/>
+        <w:tblLayout w:type="autofit"/>
+        <w:tblLook w:firstColumn="1" w:firstRow="1" w:lastColumn="0" w:lastRow="0" w:noHBand="0" w:noVBand="1" w:val="04A0"/>
+      </w:tblPr>
+      <w:tblGrid>
+        <w:gridCol w:w="3249"/>
+        <w:gridCol w:w="3249"/>
+        <w:gridCol w:w="3249"/>
+      </w:tblGrid>
+      <w:tr>
+        <w:tc>
+          <w:tcPr>
+            <w:tcW w:type="dxa" w:w="3249"/>
+          </w:tcPr>
+          <w:p>
+            <w:pPr>
+              <w:jc w:val="center"/>
+            </w:pPr>
+            <w:r/>
+            <w:r>
+              <w:rPr>
+                <w:b/>
+                <w:color w:val="12805A"/>
+                <w:sz w:val="56"/>
+              </w:rPr>
+              <w:t>100%</w:t>
+            </w:r>
+          </w:p>
+          <w:p>
+            <w:pPr>
+              <w:jc w:val="center"/>
+            </w:pPr>
+            <w:r>
+              <w:rPr>
+                <w:color w:val="42506B"/>
+                <w:sz w:val="17"/>
+              </w:rPr>
+              <w:t>Contenido técnico y arquitectura</w:t>
+              <w:br/>
+              <w:t>(listo para el 7-sep)</w:t>
+            </w:r>
+          </w:p>
+        </w:tc>
+        <w:tc>
+          <w:tcPr>
+            <w:tcW w:type="dxa" w:w="3249"/>
+          </w:tcPr>
+          <w:p>
+            <w:pPr>
+              <w:jc w:val="center"/>
+            </w:pPr>
+            <w:r/>
+            <w:r>
+              <w:rPr>
+                <w:b/>
+                <w:color w:val="A32F2F"/>
+                <w:sz w:val="56"/>
+              </w:rPr>
+              <w:t>~15%</w:t>
+            </w:r>
+          </w:p>
+          <w:p>
+            <w:pPr>
+              <w:jc w:val="center"/>
+            </w:pPr>
+            <w:r>
+              <w:rPr>
+                <w:color w:val="42506B"/>
+                <w:sz w:val="17"/>
+              </w:rPr>
+              <w:t>Habilitantes jurídicos,</w:t>
+              <w:br/>
+              <w:t>financieros y comerciales</w:t>
+            </w:r>
+          </w:p>
+        </w:tc>
+        <w:tc>
+          <w:tcPr>
+            <w:tcW w:type="dxa" w:w="3249"/>
+          </w:tcPr>
+          <w:p>
+            <w:pPr>
+              <w:jc w:val="center"/>
+            </w:pPr>
+            <w:r/>
+            <w:r>
+              <w:rPr>
+                <w:b/>
+                <w:color w:val="0B5ED7"/>
+                <w:sz w:val="56"/>
+              </w:rPr>
+              <w:t>~60%</w:t>
+            </w:r>
+          </w:p>
+          <w:p>
+            <w:pPr>
+              <w:jc w:val="center"/>
+            </w:pPr>
+            <w:r>
+              <w:rPr>
+                <w:color w:val="42506B"/>
+                <w:sz w:val="17"/>
+              </w:rPr>
+              <w:t>Cumplimiento global ponderado</w:t>
+              <w:br/>
+              <w:t>para la fecha límite</w:t>
+            </w:r>
+          </w:p>
+        </w:tc>
+      </w:tr>
+    </w:tbl>
     <w:p/>
+    <w:p>
+      <w:r>
+        <w:rPr>
+          <w:i/>
+          <w:color w:val="42506B"/>
+          <w:sz w:val="18"/>
+        </w:rPr>
+        <w:t>El 60% global pondera más el contenido técnico (lo que el TdR pide explícitamente para el 7-sep) que los habilitantes (que probablemente aplican al cierre del 16-sep, pero conviene confirmarlo con la ECI o el TdR para no arriesgar nada).</w:t>
+      </w:r>
+    </w:p>
+    <w:p>
+      <w:r>
+        <w:br w:type="page"/>
+      </w:r>
+    </w:p>
     <w:p>
       <w:pPr>
         <w:pStyle w:val="Heading1"/>
@@ -93,7 +234,7 @@
       <w:tr>
         <w:tc>
           <w:tcPr>
-            <w:tcW w:type="dxa" w:w="4252"/>
+            <w:tcW w:type="dxa" w:w="3969"/>
             <w:shd w:val="clear" w:color="auto" w:fill="DCE6F5"/>
           </w:tcPr>
           <w:p>
@@ -110,7 +251,7 @@
         </w:tc>
         <w:tc>
           <w:tcPr>
-            <w:tcW w:type="dxa" w:w="3685"/>
+            <w:tcW w:type="dxa" w:w="3515"/>
             <w:shd w:val="clear" w:color="auto" w:fill="DCE6F5"/>
           </w:tcPr>
           <w:p>
@@ -127,7 +268,7 @@
         </w:tc>
         <w:tc>
           <w:tcPr>
-            <w:tcW w:type="dxa" w:w="1247"/>
+            <w:tcW w:type="dxa" w:w="1701"/>
             <w:shd w:val="clear" w:color="auto" w:fill="DCE6F5"/>
           </w:tcPr>
           <w:p>
@@ -138,7 +279,7 @@
                 <w:color w:val="08387F"/>
                 <w:sz w:val="18"/>
               </w:rPr>
-              <w:t>Bloqueante</w:t>
+              <w:t>Bloqueante para 7-sep</w:t>
             </w:r>
           </w:p>
         </w:tc>
@@ -146,7 +287,7 @@
       <w:tr>
         <w:tc>
           <w:tcPr>
-            <w:tcW w:type="dxa" w:w="4252"/>
+            <w:tcW w:type="dxa" w:w="3969"/>
           </w:tcPr>
           <w:p>
             <w:r/>
@@ -155,13 +296,13 @@
                 <w:b w:val="0"/>
                 <w:sz w:val="18"/>
               </w:rPr>
-              <w:t>Arquitectura técnica y cotizaciones de hardware</w:t>
+              <w:t>Arquitectura técnica integrada (Sangfor + Cydesys HPE)</w:t>
             </w:r>
           </w:p>
         </w:tc>
         <w:tc>
           <w:tcPr>
-            <w:tcW w:type="dxa" w:w="3685"/>
+            <w:tcW w:type="dxa" w:w="3515"/>
           </w:tcPr>
           <w:p>
             <w:r/>
@@ -170,13 +311,13 @@
                 <w:b w:val="0"/>
                 <w:sz w:val="18"/>
               </w:rPr>
-              <w:t>Listo — dos rutas cotizadas (HPE / Dell)</w:t>
+              <w:t>Listo — presentación técnica final consolidada</w:t>
             </w:r>
           </w:p>
         </w:tc>
         <w:tc>
           <w:tcPr>
-            <w:tcW w:type="dxa" w:w="1247"/>
+            <w:tcW w:type="dxa" w:w="1701"/>
           </w:tcPr>
           <w:p>
             <w:r/>
@@ -193,7 +334,195 @@
       <w:tr>
         <w:tc>
           <w:tcPr>
-            <w:tcW w:type="dxa" w:w="4252"/>
+            <w:tcW w:type="dxa" w:w="3969"/>
+          </w:tcPr>
+          <w:p>
+            <w:r/>
+            <w:r>
+              <w:rPr>
+                <w:b w:val="0"/>
+                <w:sz w:val="18"/>
+              </w:rPr>
+              <w:t>Cotización de hardware (Opción A HPE / Opción B Dell)</w:t>
+            </w:r>
+          </w:p>
+        </w:tc>
+        <w:tc>
+          <w:tcPr>
+            <w:tcW w:type="dxa" w:w="3515"/>
+          </w:tcPr>
+          <w:p>
+            <w:r/>
+            <w:r>
+              <w:rPr>
+                <w:b w:val="0"/>
+                <w:sz w:val="18"/>
+              </w:rPr>
+              <w:t>Listo — dos rutas cotizadas y comparadas</w:t>
+            </w:r>
+          </w:p>
+        </w:tc>
+        <w:tc>
+          <w:tcPr>
+            <w:tcW w:type="dxa" w:w="1701"/>
+          </w:tcPr>
+          <w:p>
+            <w:r/>
+            <w:r>
+              <w:rPr>
+                <w:b w:val="0"/>
+                <w:sz w:val="18"/>
+              </w:rPr>
+              <w:t>No</w:t>
+            </w:r>
+          </w:p>
+        </w:tc>
+      </w:tr>
+      <w:tr>
+        <w:tc>
+          <w:tcPr>
+            <w:tcW w:type="dxa" w:w="3969"/>
+          </w:tcPr>
+          <w:p>
+            <w:r/>
+            <w:r>
+              <w:rPr>
+                <w:b w:val="0"/>
+                <w:sz w:val="18"/>
+              </w:rPr>
+              <w:t>Presentación técnica final (deck consolidado)</w:t>
+            </w:r>
+          </w:p>
+        </w:tc>
+        <w:tc>
+          <w:tcPr>
+            <w:tcW w:type="dxa" w:w="3515"/>
+          </w:tcPr>
+          <w:p>
+            <w:r/>
+            <w:r>
+              <w:rPr>
+                <w:b w:val="0"/>
+                <w:sz w:val="18"/>
+              </w:rPr>
+              <w:t>Listo — generada y publicada en el portal</w:t>
+            </w:r>
+          </w:p>
+        </w:tc>
+        <w:tc>
+          <w:tcPr>
+            <w:tcW w:type="dxa" w:w="1701"/>
+          </w:tcPr>
+          <w:p>
+            <w:r/>
+            <w:r>
+              <w:rPr>
+                <w:b w:val="0"/>
+                <w:sz w:val="18"/>
+              </w:rPr>
+              <w:t>No</w:t>
+            </w:r>
+          </w:p>
+        </w:tc>
+      </w:tr>
+      <w:tr>
+        <w:tc>
+          <w:tcPr>
+            <w:tcW w:type="dxa" w:w="3969"/>
+          </w:tcPr>
+          <w:p>
+            <w:r/>
+            <w:r>
+              <w:rPr>
+                <w:b w:val="0"/>
+                <w:sz w:val="18"/>
+              </w:rPr>
+              <w:t>Estructura de la propuesta / mapeo contra el TdR</w:t>
+            </w:r>
+          </w:p>
+        </w:tc>
+        <w:tc>
+          <w:tcPr>
+            <w:tcW w:type="dxa" w:w="3515"/>
+          </w:tcPr>
+          <w:p>
+            <w:r/>
+            <w:r>
+              <w:rPr>
+                <w:b w:val="0"/>
+                <w:sz w:val="18"/>
+              </w:rPr>
+              <w:t>Listo</w:t>
+            </w:r>
+          </w:p>
+        </w:tc>
+        <w:tc>
+          <w:tcPr>
+            <w:tcW w:type="dxa" w:w="1701"/>
+          </w:tcPr>
+          <w:p>
+            <w:r/>
+            <w:r>
+              <w:rPr>
+                <w:b w:val="0"/>
+                <w:sz w:val="18"/>
+              </w:rPr>
+              <w:t>No</w:t>
+            </w:r>
+          </w:p>
+        </w:tc>
+      </w:tr>
+      <w:tr>
+        <w:tc>
+          <w:tcPr>
+            <w:tcW w:type="dxa" w:w="3969"/>
+          </w:tcPr>
+          <w:p>
+            <w:r/>
+            <w:r>
+              <w:rPr>
+                <w:b w:val="0"/>
+                <w:sz w:val="18"/>
+              </w:rPr>
+              <w:t>Acuerdos de Nivel de Servicio (ANS/SLA)</w:t>
+            </w:r>
+          </w:p>
+        </w:tc>
+        <w:tc>
+          <w:tcPr>
+            <w:tcW w:type="dxa" w:w="3515"/>
+          </w:tcPr>
+          <w:p>
+            <w:r/>
+            <w:r>
+              <w:rPr>
+                <w:b w:val="0"/>
+                <w:sz w:val="18"/>
+              </w:rPr>
+              <w:t>Listo</w:t>
+            </w:r>
+          </w:p>
+        </w:tc>
+        <w:tc>
+          <w:tcPr>
+            <w:tcW w:type="dxa" w:w="1701"/>
+          </w:tcPr>
+          <w:p>
+            <w:r/>
+            <w:r>
+              <w:rPr>
+                <w:b w:val="0"/>
+                <w:sz w:val="18"/>
+              </w:rPr>
+              <w:t>No</w:t>
+            </w:r>
+          </w:p>
+        </w:tc>
+      </w:tr>
+      <w:tr>
+        <w:tc>
+          <w:tcPr>
+            <w:tcW w:type="dxa" w:w="3969"/>
           </w:tcPr>
           <w:p>
             <w:r/>
@@ -208,7 +537,7 @@
         </w:tc>
         <w:tc>
           <w:tcPr>
-            <w:tcW w:type="dxa" w:w="3685"/>
+            <w:tcW w:type="dxa" w:w="3515"/>
           </w:tcPr>
           <w:p>
             <w:r/>
@@ -223,7 +552,7 @@
         </w:tc>
         <w:tc>
           <w:tcPr>
-            <w:tcW w:type="dxa" w:w="1247"/>
+            <w:tcW w:type="dxa" w:w="1701"/>
           </w:tcPr>
           <w:p>
             <w:r/>
@@ -232,7 +561,7 @@
                 <w:b w:val="0"/>
                 <w:sz w:val="18"/>
               </w:rPr>
-              <w:t>Sí</w:t>
+              <w:t>Posible — validar con la ECI</w:t>
             </w:r>
           </w:p>
         </w:tc>
@@ -240,7 +569,7 @@
       <w:tr>
         <w:tc>
           <w:tcPr>
-            <w:tcW w:type="dxa" w:w="4252"/>
+            <w:tcW w:type="dxa" w:w="3969"/>
           </w:tcPr>
           <w:p>
             <w:r/>
@@ -255,7 +584,7 @@
         </w:tc>
         <w:tc>
           <w:tcPr>
-            <w:tcW w:type="dxa" w:w="3685"/>
+            <w:tcW w:type="dxa" w:w="3515"/>
           </w:tcPr>
           <w:p>
             <w:r/>
@@ -270,7 +599,7 @@
         </w:tc>
         <w:tc>
           <w:tcPr>
-            <w:tcW w:type="dxa" w:w="1247"/>
+            <w:tcW w:type="dxa" w:w="1701"/>
           </w:tcPr>
           <w:p>
             <w:r/>
@@ -279,7 +608,7 @@
                 <w:b w:val="0"/>
                 <w:sz w:val="18"/>
               </w:rPr>
-              <w:t>Sí</w:t>
+              <w:t>Posible — validar con la ECI</w:t>
             </w:r>
           </w:p>
         </w:tc>
@@ -287,7 +616,7 @@
       <w:tr>
         <w:tc>
           <w:tcPr>
-            <w:tcW w:type="dxa" w:w="4252"/>
+            <w:tcW w:type="dxa" w:w="3969"/>
           </w:tcPr>
           <w:p>
             <w:r/>
@@ -302,7 +631,7 @@
         </w:tc>
         <w:tc>
           <w:tcPr>
-            <w:tcW w:type="dxa" w:w="3685"/>
+            <w:tcW w:type="dxa" w:w="3515"/>
           </w:tcPr>
           <w:p>
             <w:r/>
@@ -317,7 +646,7 @@
         </w:tc>
         <w:tc>
           <w:tcPr>
-            <w:tcW w:type="dxa" w:w="1247"/>
+            <w:tcW w:type="dxa" w:w="1701"/>
           </w:tcPr>
           <w:p>
             <w:r/>
@@ -326,7 +655,7 @@
                 <w:b w:val="0"/>
                 <w:sz w:val="18"/>
               </w:rPr>
-              <w:t>Sí</w:t>
+              <w:t>Posible — validar con la ECI</w:t>
             </w:r>
           </w:p>
         </w:tc>
@@ -334,7 +663,7 @@
       <w:tr>
         <w:tc>
           <w:tcPr>
-            <w:tcW w:type="dxa" w:w="4252"/>
+            <w:tcW w:type="dxa" w:w="3969"/>
           </w:tcPr>
           <w:p>
             <w:r/>
@@ -349,7 +678,7 @@
         </w:tc>
         <w:tc>
           <w:tcPr>
-            <w:tcW w:type="dxa" w:w="3685"/>
+            <w:tcW w:type="dxa" w:w="3515"/>
           </w:tcPr>
           <w:p>
             <w:r/>
@@ -364,7 +693,7 @@
         </w:tc>
         <w:tc>
           <w:tcPr>
-            <w:tcW w:type="dxa" w:w="1247"/>
+            <w:tcW w:type="dxa" w:w="1701"/>
           </w:tcPr>
           <w:p>
             <w:r/>
@@ -373,7 +702,7 @@
                 <w:b w:val="0"/>
                 <w:sz w:val="18"/>
               </w:rPr>
-              <w:t>Sí</w:t>
+              <w:t>Posible — validar con la ECI</w:t>
             </w:r>
           </w:p>
         </w:tc>
@@ -381,7 +710,7 @@
       <w:tr>
         <w:tc>
           <w:tcPr>
-            <w:tcW w:type="dxa" w:w="4252"/>
+            <w:tcW w:type="dxa" w:w="3969"/>
           </w:tcPr>
           <w:p>
             <w:r/>
@@ -396,7 +725,7 @@
         </w:tc>
         <w:tc>
           <w:tcPr>
-            <w:tcW w:type="dxa" w:w="3685"/>
+            <w:tcW w:type="dxa" w:w="3515"/>
           </w:tcPr>
           <w:p>
             <w:r/>
@@ -411,7 +740,7 @@
         </w:tc>
         <w:tc>
           <w:tcPr>
-            <w:tcW w:type="dxa" w:w="1247"/>
+            <w:tcW w:type="dxa" w:w="1701"/>
           </w:tcPr>
           <w:p>
             <w:r/>
@@ -420,7 +749,7 @@
                 <w:b w:val="0"/>
                 <w:sz w:val="18"/>
               </w:rPr>
-              <w:t>Sí</w:t>
+              <w:t>Posible — validar con la ECI</w:t>
             </w:r>
           </w:p>
         </w:tc>
@@ -428,7 +757,7 @@
       <w:tr>
         <w:tc>
           <w:tcPr>
-            <w:tcW w:type="dxa" w:w="4252"/>
+            <w:tcW w:type="dxa" w:w="3969"/>
           </w:tcPr>
           <w:p>
             <w:r/>
@@ -443,7 +772,7 @@
         </w:tc>
         <w:tc>
           <w:tcPr>
-            <w:tcW w:type="dxa" w:w="3685"/>
+            <w:tcW w:type="dxa" w:w="3515"/>
           </w:tcPr>
           <w:p>
             <w:r/>
@@ -458,7 +787,7 @@
         </w:tc>
         <w:tc>
           <w:tcPr>
-            <w:tcW w:type="dxa" w:w="1247"/>
+            <w:tcW w:type="dxa" w:w="1701"/>
           </w:tcPr>
           <w:p>
             <w:r/>
@@ -467,7 +796,7 @@
                 <w:b w:val="0"/>
                 <w:sz w:val="18"/>
               </w:rPr>
-              <w:t>Sí</w:t>
+              <w:t>Posible — validar con la ECI</w:t>
             </w:r>
           </w:p>
         </w:tc>
@@ -475,7 +804,7 @@
       <w:tr>
         <w:tc>
           <w:tcPr>
-            <w:tcW w:type="dxa" w:w="4252"/>
+            <w:tcW w:type="dxa" w:w="3969"/>
           </w:tcPr>
           <w:p>
             <w:r/>
@@ -484,13 +813,13 @@
                 <w:b w:val="0"/>
                 <w:sz w:val="18"/>
               </w:rPr>
-              <w:t>Carta de aval del fabricante (Sangfor/HPE/Dell)</w:t>
+              <w:t>Carta de aval del fabricante (Sangfor/HPE)</w:t>
             </w:r>
           </w:p>
         </w:tc>
         <w:tc>
           <w:tcPr>
-            <w:tcW w:type="dxa" w:w="3685"/>
+            <w:tcW w:type="dxa" w:w="3515"/>
           </w:tcPr>
           <w:p>
             <w:r/>
@@ -505,7 +834,7 @@
         </w:tc>
         <w:tc>
           <w:tcPr>
-            <w:tcW w:type="dxa" w:w="1247"/>
+            <w:tcW w:type="dxa" w:w="1701"/>
           </w:tcPr>
           <w:p>
             <w:r/>
@@ -514,7 +843,7 @@
                 <w:b w:val="0"/>
                 <w:sz w:val="18"/>
               </w:rPr>
-              <w:t>Sí</w:t>
+              <w:t>Posible — validar con la ECI</w:t>
             </w:r>
           </w:p>
         </w:tc>
@@ -522,7 +851,7 @@
       <w:tr>
         <w:tc>
           <w:tcPr>
-            <w:tcW w:type="dxa" w:w="4252"/>
+            <w:tcW w:type="dxa" w:w="3969"/>
           </w:tcPr>
           <w:p>
             <w:r/>
@@ -537,7 +866,7 @@
         </w:tc>
         <w:tc>
           <w:tcPr>
-            <w:tcW w:type="dxa" w:w="3685"/>
+            <w:tcW w:type="dxa" w:w="3515"/>
           </w:tcPr>
           <w:p>
             <w:r/>
@@ -552,7 +881,7 @@
         </w:tc>
         <w:tc>
           <w:tcPr>
-            <w:tcW w:type="dxa" w:w="1247"/>
+            <w:tcW w:type="dxa" w:w="1701"/>
           </w:tcPr>
           <w:p>
             <w:r/>
@@ -561,7 +890,7 @@
                 <w:b w:val="0"/>
                 <w:sz w:val="18"/>
               </w:rPr>
-              <w:t>Sí</w:t>
+              <w:t>Probablemente no (aplica al 16-sep)</w:t>
             </w:r>
           </w:p>
         </w:tc>
@@ -569,7 +898,7 @@
       <w:tr>
         <w:tc>
           <w:tcPr>
-            <w:tcW w:type="dxa" w:w="4252"/>
+            <w:tcW w:type="dxa" w:w="3969"/>
           </w:tcPr>
           <w:p>
             <w:r/>
@@ -584,7 +913,7 @@
         </w:tc>
         <w:tc>
           <w:tcPr>
-            <w:tcW w:type="dxa" w:w="3685"/>
+            <w:tcW w:type="dxa" w:w="3515"/>
           </w:tcPr>
           <w:p>
             <w:r/>
@@ -593,13 +922,13 @@
                 <w:b w:val="0"/>
                 <w:sz w:val="18"/>
               </w:rPr>
-              <w:t>Plantillas sin diligenciar</w:t>
+              <w:t>Contenido listo, falta transcribir al formato oficial</w:t>
             </w:r>
           </w:p>
         </w:tc>
         <w:tc>
           <w:tcPr>
-            <w:tcW w:type="dxa" w:w="1247"/>
+            <w:tcW w:type="dxa" w:w="1701"/>
           </w:tcPr>
           <w:p>
             <w:r/>
@@ -608,7 +937,7 @@
                 <w:b w:val="0"/>
                 <w:sz w:val="18"/>
               </w:rPr>
-              <w:t>Sí</w:t>
+              <w:t>Parcial — Anexo 4 conviene tenerlo ya para el 7-sep</w:t>
             </w:r>
           </w:p>
         </w:tc>
@@ -632,6 +961,65 @@
         </w:rPr>
         <w:t>Detalle por pendiente</w:t>
       </w:r>
+    </w:p>
+    <w:p>
+      <w:pPr>
+        <w:pStyle w:val="Heading2"/>
+      </w:pPr>
+      <w:r>
+        <w:rPr>
+          <w:b/>
+          <w:color w:val="0B5ED7"/>
+          <w:sz w:val="25"/>
+        </w:rPr>
+        <w:t xml:space="preserve">0  </w:t>
+      </w:r>
+      <w:r>
+        <w:rPr>
+          <w:b/>
+          <w:color w:val="0B1220"/>
+          <w:sz w:val="25"/>
+        </w:rPr>
+        <w:t>Arquitectura técnica — YA INTEGRADA Y RESUELTA</w:t>
+      </w:r>
+    </w:p>
+    <w:p>
+      <w:r>
+        <w:rPr>
+          <w:i w:val="0"/>
+          <w:color w:val="42506B"/>
+          <w:sz w:val="20"/>
+        </w:rPr>
+        <w:t>La arquitectura de virtualización Sangfor (aSV + aNet, sin HCI completa) y la arquitectura de hardware física recomendada por Cydesys (HPE ProLiant DL380 Gen11, cabina SAN externa MSA2062) quedaron consolidadas en una sola presentación técnica final, lista para incluir en la propuesta del 7 de septiembre. La Opción B (actualización Dell) queda documentada como alternativa de menor inversión con riesgo de cumplimiento explícito.</w:t>
+      </w:r>
+    </w:p>
+    <w:p>
+      <w:pPr>
+        <w:pStyle w:val="ListBullet"/>
+      </w:pPr>
+      <w:r>
+        <w:rPr>
+          <w:b/>
+          <w:color w:val="0B1220"/>
+          <w:sz w:val="19"/>
+        </w:rPr>
+        <w:t xml:space="preserve">Acción: </w:t>
+      </w:r>
+      <w:r>
+        <w:rPr>
+          <w:color w:val="42506B"/>
+          <w:sz w:val="19"/>
+        </w:rPr>
+        <w:t xml:space="preserve"> ninguna — este punto está resuelto. Revisar la presentación final antes de radicar por si se requiere algún ajuste de última hora.</w:t>
+      </w:r>
+    </w:p>
+    <w:p>
+      <w:pPr>
+        <w:spacing w:before="40" w:after="200"/>
+        <w:pBdr>
+          <w:bottom w:val="single" w:sz="6" w:space="1" w:color="DCE6F5"/>
+        </w:pBdr>
+      </w:pPr>
     </w:p>
     <w:p>
       <w:pPr>
@@ -1035,7 +1423,7 @@
           <w:color w:val="42506B"/>
           <w:sz w:val="20"/>
         </w:rPr>
-        <w:t>El TdR exige un documento formal del fabricante (Sangfor, y HPE o Dell según la opción de hardware elegida) que avale al proponente/implementador como canal autorizado. No existe esta carta en el expediente.</w:t>
+        <w:t>El TdR exige un documento formal del fabricante (Sangfor, y HPE según la opción de hardware recomendada) que avale al proponente/implementador como canal autorizado. No existe esta carta en el expediente.</w:t>
       </w:r>
     </w:p>
     <w:p>
@@ -1055,7 +1443,7 @@
           <w:color w:val="42506B"/>
           <w:sz w:val="19"/>
         </w:rPr>
-        <w:t xml:space="preserve"> solicitar la carta de aval a Sangfor Colombia (para el software) y al fabricante de hardware correspondiente según la opción elegida (HPE o Dell).</w:t>
+        <w:t xml:space="preserve"> solicitar la carta de aval a Sangfor Colombia (para el software) y a HPE (para el hardware de la Opción A recomendada).</w:t>
       </w:r>
     </w:p>
     <w:p>
@@ -1094,7 +1482,7 @@
           <w:color w:val="42506B"/>
           <w:sz w:val="20"/>
         </w:rPr>
-        <w:t>El TdR pide incluir en la propuesta un borrador de contrato con los productos y servicios ofrecidos. Este documento no está estructurado todavía.</w:t>
+        <w:t>El TdR pide incluir en la propuesta un borrador de contrato con los productos y servicios ofrecidos. Este documento no está estructurado todavía — aplica probablemente a la propuesta final del 16-sep, no a la técnica del 7-sep.</w:t>
       </w:r>
     </w:p>
     <w:p>
@@ -1114,7 +1502,7 @@
           <w:color w:val="42506B"/>
           <w:sz w:val="19"/>
         </w:rPr>
-        <w:t xml:space="preserve"> redactar el borrador de contrato una vez esté definida la opción de hardware final (HPE o Dell) y cerrado el alcance económico.</w:t>
+        <w:t xml:space="preserve"> redactar el borrador de contrato una vez esté cerrado el alcance económico sobre la Opción A (HPE).</w:t>
       </w:r>
     </w:p>
     <w:p>
@@ -1153,7 +1541,7 @@
           <w:color w:val="42506B"/>
           <w:sz w:val="20"/>
         </w:rPr>
-        <w:t>Ambos anexos existen en el expediente únicamente como plantillas vacías. El Anexo 2 requiere el TCO completo a 5 años y el listado de componentes; el Anexo 4 requiere la matriz de cumplimiento técnico punto por punto contra los requerimientos del datacenter.</w:t>
+        <w:t>Ambos anexos existen en el expediente únicamente como plantillas vacías. El contenido técnico para el Anexo 4 ya existe (arquitectura, cumplimiento punto por punto) — solo falta transcribirlo al formato oficial, lo cual conviene tener listo para el 7-sep aunque el TdR no lo pida explícitamente ese día. El Anexo 2 requiere las cifras de TCO, que dependen de la opción de hardware finalmente elegida — aplica al 16-sep.</w:t>
       </w:r>
     </w:p>
     <w:p>
@@ -1173,7 +1561,7 @@
           <w:color w:val="42506B"/>
           <w:sz w:val="19"/>
         </w:rPr>
-        <w:t xml:space="preserve"> diligenciar el Anexo 4 con el cumplimiento punto por punto (ya tenemos el contenido en la Solución técnica, solo falta trasladarlo al formato oficial) y el Anexo 2 con el TCO de la opción de hardware elegida (cifras en el documento comercial reservado).</w:t>
+        <w:t xml:space="preserve"> transcribir el cumplimiento técnico ya documentado al formato oficial del Anexo 4 antes del 7-sep, como respaldo de la propuesta técnica.</w:t>
       </w:r>
     </w:p>
     <w:p>
@@ -1215,7 +1603,7 @@
           <w:color w:val="42506B"/>
           <w:sz w:val="19"/>
         </w:rPr>
-        <w:t>Dos rutas de hardware completas y cotizadas por Cydesys: Opción A (HPE ProLiant DL380 Gen11, nueva, cumple Anexo 4) y Opción B (actualización Dell R740, menor inversión, riesgo de cumplimiento a validar).</w:t>
+        <w:t>Arquitectura de hardware HPE ProLiant DL380 Gen11 recomendada, con Opción Dell como alternativa documentada con su riesgo de cumplimiento.</w:t>
       </w:r>
     </w:p>
     <w:p>
@@ -1227,7 +1615,7 @@
           <w:color w:val="42506B"/>
           <w:sz w:val="19"/>
         </w:rPr>
-        <w:t>Presentación ejecutiva de la solución de virtualización (NotebookLM) y de las dos opciones de hardware, con identidad visual editorial.</w:t>
+        <w:t>Presentación técnica final consolidada (Sangfor + Cydesys HPE) generada, con identidad visual editorial, lista para incluir en la propuesta del 7 de septiembre.</w:t>
       </w:r>
     </w:p>
     <w:p>
@@ -1266,6 +1654,18 @@
         <w:t>Cronograma vigente y respuestas oficiales de la ECI ya incorporadas.</w:t>
       </w:r>
     </w:p>
+    <w:p>
+      <w:pPr>
+        <w:pStyle w:val="ListBullet"/>
+      </w:pPr>
+      <w:r>
+        <w:rPr>
+          <w:color w:val="42506B"/>
+          <w:sz w:val="19"/>
+        </w:rPr>
+        <w:t>Recomendación técnica clara y documentada entre las dos rutas de hardware (HPE sin riesgo vs. Dell con riesgo de cumplimiento).</w:t>
+      </w:r>
+    </w:p>
     <w:p/>
     <w:p>
       <w:r>
@@ -1274,7 +1674,7 @@
           <w:color w:val="42506B"/>
           <w:sz w:val="16"/>
         </w:rPr>
-        <w:t>Blue Label Technologies · Cydesys · Escuela Colombiana de Ingeniería Julio Garavito — documento de trabajo interno, actualizado el 4 de septiembre de 2026.</w:t>
+        <w:t>Blue Label Technologies · Cydesys · Escuela Colombiana de Ingeniería Julio Garavito — documento de trabajo interno, actualizado el 5 de septiembre de 2026.</w:t>
       </w:r>
     </w:p>
     <w:sectPr>

</xml_diff>

<commit_message>
Actualizar checklist: documentos BLT recibidos, cumplimiento global ~80%
</commit_message>
<xml_diff>
--- a/checklist-cierre-propuesta-eci.docx
+++ b/checklist-cierre-propuesta-eci.docx
@@ -50,7 +50,7 @@
           <w:color w:val="42506B"/>
           <w:sz w:val="19"/>
         </w:rPr>
-        <w:t>Actualizado el 5 de septiembre de 2026, tras integrar la arquitectura Sangfor + Cydesys (HPE) en la presentación técnica final. Fecha límite de envío de la propuesta técnica: 7 de septiembre de 2026, 12:00 pm.</w:t>
+        <w:t>Actualizado el 5 de septiembre de 2026, tras recibir los documentos jurídicos y financieros de Blue Label Technologies. Fecha límite de envío de la propuesta técnica: 7 de septiembre de 2026, 12:00 pm.</w:t>
       </w:r>
     </w:p>
     <w:p/>
@@ -74,7 +74,7 @@
           <w:color w:val="42506B"/>
           <w:sz w:val="19"/>
         </w:rPr>
-        <w:t>El TdR exige para esta fecha el envío de la “propuesta técnica (arquitectura y modelo ofertado)”. Ese componente está resuelto. El riesgo real está en si el TdR también exige los habilitantes jurídicos/financieros junto con la técnica — validar esto es la primera acción del día.</w:t>
+        <w:t>Con los documentos de Blue Label Technologies recibidos, el bloqueante más grave del checklist anterior (BLT sin ningún documento propio) queda resuelto. Persisten dos vencimientos de fecha (Cámara de Comercio de ambas empresas) y algunos documentos comerciales (póliza, carta de aval, contrato).</w:t>
       </w:r>
     </w:p>
     <w:tbl>
@@ -134,10 +134,10 @@
             <w:r>
               <w:rPr>
                 <w:b/>
-                <w:color w:val="A32F2F"/>
+                <w:color w:val="B4560D"/>
                 <w:sz w:val="56"/>
               </w:rPr>
-              <w:t>~15%</w:t>
+              <w:t>~55%</w:t>
             </w:r>
           </w:p>
           <w:p>
@@ -170,7 +170,7 @@
                 <w:color w:val="0B5ED7"/>
                 <w:sz w:val="56"/>
               </w:rPr>
-              <w:t>~60%</w:t>
+              <w:t>~80%</w:t>
             </w:r>
           </w:p>
           <w:p>
@@ -198,7 +198,7 @@
           <w:color w:val="42506B"/>
           <w:sz w:val="18"/>
         </w:rPr>
-        <w:t>El 60% global pondera más el contenido técnico (lo que el TdR pide explícitamente para el 7-sep) que los habilitantes (que probablemente aplican al cierre del 16-sep, pero conviene confirmarlo con la ECI o el TdR para no arriesgar nada).</w:t>
+        <w:t>Salto de ~60% a ~80% en el cumplimiento global tras recibir RUT, Cámara de Comercio, estados financieros, certificación bancaria, certificados de Contraloría y Procuraduría (BLT y representante legal), y tres cartas de experiencia comercial de Blue Label Technologies.</w:t>
       </w:r>
     </w:p>
     <w:p>
@@ -251,7 +251,7 @@
         </w:tc>
         <w:tc>
           <w:tcPr>
-            <w:tcW w:type="dxa" w:w="3515"/>
+            <w:tcW w:type="dxa" w:w="3628"/>
             <w:shd w:val="clear" w:color="auto" w:fill="DCE6F5"/>
           </w:tcPr>
           <w:p>
@@ -268,7 +268,7 @@
         </w:tc>
         <w:tc>
           <w:tcPr>
-            <w:tcW w:type="dxa" w:w="1701"/>
+            <w:tcW w:type="dxa" w:w="1587"/>
             <w:shd w:val="clear" w:color="auto" w:fill="DCE6F5"/>
           </w:tcPr>
           <w:p>
@@ -302,7 +302,7 @@
         </w:tc>
         <w:tc>
           <w:tcPr>
-            <w:tcW w:type="dxa" w:w="3515"/>
+            <w:tcW w:type="dxa" w:w="3628"/>
           </w:tcPr>
           <w:p>
             <w:r/>
@@ -317,7 +317,7 @@
         </w:tc>
         <w:tc>
           <w:tcPr>
-            <w:tcW w:type="dxa" w:w="1701"/>
+            <w:tcW w:type="dxa" w:w="1587"/>
           </w:tcPr>
           <w:p>
             <w:r/>
@@ -349,7 +349,7 @@
         </w:tc>
         <w:tc>
           <w:tcPr>
-            <w:tcW w:type="dxa" w:w="3515"/>
+            <w:tcW w:type="dxa" w:w="3628"/>
           </w:tcPr>
           <w:p>
             <w:r/>
@@ -364,7 +364,7 @@
         </w:tc>
         <w:tc>
           <w:tcPr>
-            <w:tcW w:type="dxa" w:w="1701"/>
+            <w:tcW w:type="dxa" w:w="1587"/>
           </w:tcPr>
           <w:p>
             <w:r/>
@@ -396,7 +396,7 @@
         </w:tc>
         <w:tc>
           <w:tcPr>
-            <w:tcW w:type="dxa" w:w="3515"/>
+            <w:tcW w:type="dxa" w:w="3628"/>
           </w:tcPr>
           <w:p>
             <w:r/>
@@ -411,7 +411,7 @@
         </w:tc>
         <w:tc>
           <w:tcPr>
-            <w:tcW w:type="dxa" w:w="1701"/>
+            <w:tcW w:type="dxa" w:w="1587"/>
           </w:tcPr>
           <w:p>
             <w:r/>
@@ -437,13 +437,13 @@
                 <w:b w:val="0"/>
                 <w:sz w:val="18"/>
               </w:rPr>
-              <w:t>Estructura de la propuesta / mapeo contra el TdR</w:t>
+              <w:t>RUT de Blue Label Technologies</w:t>
             </w:r>
           </w:p>
         </w:tc>
         <w:tc>
           <w:tcPr>
-            <w:tcW w:type="dxa" w:w="3515"/>
+            <w:tcW w:type="dxa" w:w="3628"/>
           </w:tcPr>
           <w:p>
             <w:r/>
@@ -452,13 +452,201 @@
                 <w:b w:val="0"/>
                 <w:sz w:val="18"/>
               </w:rPr>
-              <w:t>Listo</w:t>
+              <w:t>Recibido (emitido 19-may-2026) — verificar vigencia frente al plazo del TdR</w:t>
             </w:r>
           </w:p>
         </w:tc>
         <w:tc>
           <w:tcPr>
-            <w:tcW w:type="dxa" w:w="1701"/>
+            <w:tcW w:type="dxa" w:w="1587"/>
+          </w:tcPr>
+          <w:p>
+            <w:r/>
+            <w:r>
+              <w:rPr>
+                <w:b w:val="0"/>
+                <w:sz w:val="18"/>
+              </w:rPr>
+              <w:t>Posible</w:t>
+            </w:r>
+          </w:p>
+        </w:tc>
+      </w:tr>
+      <w:tr>
+        <w:tc>
+          <w:tcPr>
+            <w:tcW w:type="dxa" w:w="3969"/>
+          </w:tcPr>
+          <w:p>
+            <w:r/>
+            <w:r>
+              <w:rPr>
+                <w:b w:val="0"/>
+                <w:sz w:val="18"/>
+              </w:rPr>
+              <w:t>Cámara de Comercio de Blue Label Technologies</w:t>
+            </w:r>
+          </w:p>
+        </w:tc>
+        <w:tc>
+          <w:tcPr>
+            <w:tcW w:type="dxa" w:w="3628"/>
+          </w:tcPr>
+          <w:p>
+            <w:r/>
+            <w:r>
+              <w:rPr>
+                <w:b w:val="0"/>
+                <w:sz w:val="18"/>
+              </w:rPr>
+              <w:t>Recibido pero vencido para la fecha de cierre (expedido 19-may-2026)</w:t>
+            </w:r>
+          </w:p>
+        </w:tc>
+        <w:tc>
+          <w:tcPr>
+            <w:tcW w:type="dxa" w:w="1587"/>
+          </w:tcPr>
+          <w:p>
+            <w:r/>
+            <w:r>
+              <w:rPr>
+                <w:b w:val="0"/>
+                <w:sz w:val="18"/>
+              </w:rPr>
+              <w:t>Sí — renovar</w:t>
+            </w:r>
+          </w:p>
+        </w:tc>
+      </w:tr>
+      <w:tr>
+        <w:tc>
+          <w:tcPr>
+            <w:tcW w:type="dxa" w:w="3969"/>
+          </w:tcPr>
+          <w:p>
+            <w:r/>
+            <w:r>
+              <w:rPr>
+                <w:b w:val="0"/>
+                <w:sz w:val="18"/>
+              </w:rPr>
+              <w:t>Cámara de Comercio de Cydesys/Cyberware</w:t>
+            </w:r>
+          </w:p>
+        </w:tc>
+        <w:tc>
+          <w:tcPr>
+            <w:tcW w:type="dxa" w:w="3628"/>
+          </w:tcPr>
+          <w:p>
+            <w:r/>
+            <w:r>
+              <w:rPr>
+                <w:b w:val="0"/>
+                <w:sz w:val="18"/>
+              </w:rPr>
+              <w:t>Vencida para la fecha de cierre (expedida 11-ago-2026)</w:t>
+            </w:r>
+          </w:p>
+        </w:tc>
+        <w:tc>
+          <w:tcPr>
+            <w:tcW w:type="dxa" w:w="1587"/>
+          </w:tcPr>
+          <w:p>
+            <w:r/>
+            <w:r>
+              <w:rPr>
+                <w:b w:val="0"/>
+                <w:sz w:val="18"/>
+              </w:rPr>
+              <w:t>Sí — renovar</w:t>
+            </w:r>
+          </w:p>
+        </w:tc>
+      </w:tr>
+      <w:tr>
+        <w:tc>
+          <w:tcPr>
+            <w:tcW w:type="dxa" w:w="3969"/>
+          </w:tcPr>
+          <w:p>
+            <w:r/>
+            <w:r>
+              <w:rPr>
+                <w:b w:val="0"/>
+                <w:sz w:val="18"/>
+              </w:rPr>
+              <w:t>Estados financieros 2025 de Blue Label Technologies</w:t>
+            </w:r>
+          </w:p>
+        </w:tc>
+        <w:tc>
+          <w:tcPr>
+            <w:tcW w:type="dxa" w:w="3628"/>
+          </w:tcPr>
+          <w:p>
+            <w:r/>
+            <w:r>
+              <w:rPr>
+                <w:b w:val="0"/>
+                <w:sz w:val="18"/>
+              </w:rPr>
+              <w:t>Archivo recibido, contenido pendiente de verificar (no se pudo leer el detalle numérico) — faltan intermedios 2026</w:t>
+            </w:r>
+          </w:p>
+        </w:tc>
+        <w:tc>
+          <w:tcPr>
+            <w:tcW w:type="dxa" w:w="1587"/>
+          </w:tcPr>
+          <w:p>
+            <w:r/>
+            <w:r>
+              <w:rPr>
+                <w:b w:val="0"/>
+                <w:sz w:val="18"/>
+              </w:rPr>
+              <w:t>Posible</w:t>
+            </w:r>
+          </w:p>
+        </w:tc>
+      </w:tr>
+      <w:tr>
+        <w:tc>
+          <w:tcPr>
+            <w:tcW w:type="dxa" w:w="3969"/>
+          </w:tcPr>
+          <w:p>
+            <w:r/>
+            <w:r>
+              <w:rPr>
+                <w:b w:val="0"/>
+                <w:sz w:val="18"/>
+              </w:rPr>
+              <w:t>Certificación bancaria, Contraloría y Procuraduría (BLT + representante legal)</w:t>
+            </w:r>
+          </w:p>
+        </w:tc>
+        <w:tc>
+          <w:tcPr>
+            <w:tcW w:type="dxa" w:w="3628"/>
+          </w:tcPr>
+          <w:p>
+            <w:r/>
+            <w:r>
+              <w:rPr>
+                <w:b w:val="0"/>
+                <w:sz w:val="18"/>
+              </w:rPr>
+              <w:t>Recibidas y vigentes (14-may-2026), sin reportes ni sanciones</w:t>
+            </w:r>
+          </w:p>
+        </w:tc>
+        <w:tc>
+          <w:tcPr>
+            <w:tcW w:type="dxa" w:w="1587"/>
           </w:tcPr>
           <w:p>
             <w:r/>
@@ -484,13 +672,13 @@
                 <w:b w:val="0"/>
                 <w:sz w:val="18"/>
               </w:rPr>
-              <w:t>Acuerdos de Nivel de Servicio (ANS/SLA)</w:t>
+              <w:t>Cédula del representante legal (Camilo Gómez Uribe)</w:t>
             </w:r>
           </w:p>
         </w:tc>
         <w:tc>
           <w:tcPr>
-            <w:tcW w:type="dxa" w:w="3515"/>
+            <w:tcW w:type="dxa" w:w="3628"/>
           </w:tcPr>
           <w:p>
             <w:r/>
@@ -499,13 +687,13 @@
                 <w:b w:val="0"/>
                 <w:sz w:val="18"/>
               </w:rPr>
-              <w:t>Listo</w:t>
+              <w:t>Archivo recibido vacío — reenviar el escaneo original</w:t>
             </w:r>
           </w:p>
         </w:tc>
         <w:tc>
           <w:tcPr>
-            <w:tcW w:type="dxa" w:w="1701"/>
+            <w:tcW w:type="dxa" w:w="1587"/>
           </w:tcPr>
           <w:p>
             <w:r/>
@@ -514,7 +702,7 @@
                 <w:b w:val="0"/>
                 <w:sz w:val="18"/>
               </w:rPr>
-              <w:t>No</w:t>
+              <w:t>Posible</w:t>
             </w:r>
           </w:p>
         </w:tc>
@@ -531,13 +719,13 @@
                 <w:b w:val="0"/>
                 <w:sz w:val="18"/>
               </w:rPr>
-              <w:t>Documentos legales/financieros de Blue Label Technologies</w:t>
+              <w:t>Certificados de experiencia / referencias comerciales</w:t>
             </w:r>
           </w:p>
         </w:tc>
         <w:tc>
           <w:tcPr>
-            <w:tcW w:type="dxa" w:w="3515"/>
+            <w:tcW w:type="dxa" w:w="3628"/>
           </w:tcPr>
           <w:p>
             <w:r/>
@@ -546,13 +734,13 @@
                 <w:b w:val="0"/>
                 <w:sz w:val="18"/>
               </w:rPr>
-              <w:t>Ausentes — 0 documentos en el expediente</w:t>
+              <w:t>Resuelto — 3 cartas recibidas (Medisinu, Indigo Technologies, Cydesys/Cyberware)</w:t>
             </w:r>
           </w:p>
         </w:tc>
         <w:tc>
           <w:tcPr>
-            <w:tcW w:type="dxa" w:w="1701"/>
+            <w:tcW w:type="dxa" w:w="1587"/>
           </w:tcPr>
           <w:p>
             <w:r/>
@@ -561,101 +749,7 @@
                 <w:b w:val="0"/>
                 <w:sz w:val="18"/>
               </w:rPr>
-              <w:t>Posible — validar con la ECI</w:t>
-            </w:r>
-          </w:p>
-        </w:tc>
-      </w:tr>
-      <w:tr>
-        <w:tc>
-          <w:tcPr>
-            <w:tcW w:type="dxa" w:w="3969"/>
-          </w:tcPr>
-          <w:p>
-            <w:r/>
-            <w:r>
-              <w:rPr>
-                <w:b w:val="0"/>
-                <w:sz w:val="18"/>
-              </w:rPr>
-              <w:t>Cámara de Comercio (Cydesys/Cyberware)</w:t>
-            </w:r>
-          </w:p>
-        </w:tc>
-        <w:tc>
-          <w:tcPr>
-            <w:tcW w:type="dxa" w:w="3515"/>
-          </w:tcPr>
-          <w:p>
-            <w:r/>
-            <w:r>
-              <w:rPr>
-                <w:b w:val="0"/>
-                <w:sz w:val="18"/>
-              </w:rPr>
-              <w:t>Vencida para la fecha de cierre (36 días, límite 30)</w:t>
-            </w:r>
-          </w:p>
-        </w:tc>
-        <w:tc>
-          <w:tcPr>
-            <w:tcW w:type="dxa" w:w="1701"/>
-          </w:tcPr>
-          <w:p>
-            <w:r/>
-            <w:r>
-              <w:rPr>
-                <w:b w:val="0"/>
-                <w:sz w:val="18"/>
-              </w:rPr>
-              <w:t>Posible — validar con la ECI</w:t>
-            </w:r>
-          </w:p>
-        </w:tc>
-      </w:tr>
-      <w:tr>
-        <w:tc>
-          <w:tcPr>
-            <w:tcW w:type="dxa" w:w="3969"/>
-          </w:tcPr>
-          <w:p>
-            <w:r/>
-            <w:r>
-              <w:rPr>
-                <w:b w:val="0"/>
-                <w:sz w:val="18"/>
-              </w:rPr>
-              <w:t>Estados financieros 2026 (intermedios)</w:t>
-            </w:r>
-          </w:p>
-        </w:tc>
-        <w:tc>
-          <w:tcPr>
-            <w:tcW w:type="dxa" w:w="3515"/>
-          </w:tcPr>
-          <w:p>
-            <w:r/>
-            <w:r>
-              <w:rPr>
-                <w:b w:val="0"/>
-                <w:sz w:val="18"/>
-              </w:rPr>
-              <w:t>Faltan — solo hay cierre 2025</w:t>
-            </w:r>
-          </w:p>
-        </w:tc>
-        <w:tc>
-          <w:tcPr>
-            <w:tcW w:type="dxa" w:w="1701"/>
-          </w:tcPr>
-          <w:p>
-            <w:r/>
-            <w:r>
-              <w:rPr>
-                <w:b w:val="0"/>
-                <w:sz w:val="18"/>
-              </w:rPr>
-              <w:t>Posible — validar con la ECI</w:t>
+              <w:t>No, con nota</w:t>
             </w:r>
           </w:p>
         </w:tc>
@@ -678,7 +772,7 @@
         </w:tc>
         <w:tc>
           <w:tcPr>
-            <w:tcW w:type="dxa" w:w="3515"/>
+            <w:tcW w:type="dxa" w:w="3628"/>
           </w:tcPr>
           <w:p>
             <w:r/>
@@ -693,7 +787,7 @@
         </w:tc>
         <w:tc>
           <w:tcPr>
-            <w:tcW w:type="dxa" w:w="1701"/>
+            <w:tcW w:type="dxa" w:w="1587"/>
           </w:tcPr>
           <w:p>
             <w:r/>
@@ -725,7 +819,7 @@
         </w:tc>
         <w:tc>
           <w:tcPr>
-            <w:tcW w:type="dxa" w:w="3515"/>
+            <w:tcW w:type="dxa" w:w="3628"/>
           </w:tcPr>
           <w:p>
             <w:r/>
@@ -740,54 +834,7 @@
         </w:tc>
         <w:tc>
           <w:tcPr>
-            <w:tcW w:type="dxa" w:w="1701"/>
-          </w:tcPr>
-          <w:p>
-            <w:r/>
-            <w:r>
-              <w:rPr>
-                <w:b w:val="0"/>
-                <w:sz w:val="18"/>
-              </w:rPr>
-              <w:t>Posible — validar con la ECI</w:t>
-            </w:r>
-          </w:p>
-        </w:tc>
-      </w:tr>
-      <w:tr>
-        <w:tc>
-          <w:tcPr>
-            <w:tcW w:type="dxa" w:w="3969"/>
-          </w:tcPr>
-          <w:p>
-            <w:r/>
-            <w:r>
-              <w:rPr>
-                <w:b w:val="0"/>
-                <w:sz w:val="18"/>
-              </w:rPr>
-              <w:t>Certificados de experiencia (mín. 3 referencias)</w:t>
-            </w:r>
-          </w:p>
-        </w:tc>
-        <w:tc>
-          <w:tcPr>
-            <w:tcW w:type="dxa" w:w="3515"/>
-          </w:tcPr>
-          <w:p>
-            <w:r/>
-            <w:r>
-              <w:rPr>
-                <w:b w:val="0"/>
-                <w:sz w:val="18"/>
-              </w:rPr>
-              <w:t>Ausentes por completo</w:t>
-            </w:r>
-          </w:p>
-        </w:tc>
-        <w:tc>
-          <w:tcPr>
-            <w:tcW w:type="dxa" w:w="1701"/>
+            <w:tcW w:type="dxa" w:w="1587"/>
           </w:tcPr>
           <w:p>
             <w:r/>
@@ -819,7 +866,7 @@
         </w:tc>
         <w:tc>
           <w:tcPr>
-            <w:tcW w:type="dxa" w:w="3515"/>
+            <w:tcW w:type="dxa" w:w="3628"/>
           </w:tcPr>
           <w:p>
             <w:r/>
@@ -834,7 +881,7 @@
         </w:tc>
         <w:tc>
           <w:tcPr>
-            <w:tcW w:type="dxa" w:w="1701"/>
+            <w:tcW w:type="dxa" w:w="1587"/>
           </w:tcPr>
           <w:p>
             <w:r/>
@@ -866,7 +913,7 @@
         </w:tc>
         <w:tc>
           <w:tcPr>
-            <w:tcW w:type="dxa" w:w="3515"/>
+            <w:tcW w:type="dxa" w:w="3628"/>
           </w:tcPr>
           <w:p>
             <w:r/>
@@ -881,7 +928,7 @@
         </w:tc>
         <w:tc>
           <w:tcPr>
-            <w:tcW w:type="dxa" w:w="1701"/>
+            <w:tcW w:type="dxa" w:w="1587"/>
           </w:tcPr>
           <w:p>
             <w:r/>
@@ -913,7 +960,7 @@
         </w:tc>
         <w:tc>
           <w:tcPr>
-            <w:tcW w:type="dxa" w:w="3515"/>
+            <w:tcW w:type="dxa" w:w="3628"/>
           </w:tcPr>
           <w:p>
             <w:r/>
@@ -928,7 +975,7 @@
         </w:tc>
         <w:tc>
           <w:tcPr>
-            <w:tcW w:type="dxa" w:w="1701"/>
+            <w:tcW w:type="dxa" w:w="1587"/>
           </w:tcPr>
           <w:p>
             <w:r/>
@@ -990,7 +1037,7 @@
           <w:color w:val="42506B"/>
           <w:sz w:val="20"/>
         </w:rPr>
-        <w:t>La arquitectura de virtualización Sangfor (aSV + aNet, sin HCI completa) y la arquitectura de hardware física recomendada por Cydesys (HPE ProLiant DL380 Gen11, cabina SAN externa MSA2062) quedaron consolidadas en una sola presentación técnica final, lista para incluir en la propuesta del 7 de septiembre. La Opción B (actualización Dell) queda documentada como alternativa de menor inversión con riesgo de cumplimiento explícito.</w:t>
+        <w:t>La arquitectura de virtualización Sangfor (aSV + aNet, sin HCI completa) y la arquitectura de hardware física recomendada por Cydesys (HPE ProLiant DL380 Gen11, cabina SAN externa MSA2062) quedaron consolidadas en una sola presentación técnica final, lista para incluir en la propuesta del 7 de septiembre.</w:t>
       </w:r>
     </w:p>
     <w:p>
@@ -1010,7 +1057,7 @@
           <w:color w:val="42506B"/>
           <w:sz w:val="19"/>
         </w:rPr>
-        <w:t xml:space="preserve"> ninguna — este punto está resuelto. Revisar la presentación final antes de radicar por si se requiere algún ajuste de última hora.</w:t>
+        <w:t xml:space="preserve"> ninguna — este punto está resuelto.</w:t>
       </w:r>
     </w:p>
     <w:p>
@@ -1039,7 +1086,7 @@
           <w:color w:val="0B1220"/>
           <w:sz w:val="25"/>
         </w:rPr>
-        <w:t>Documentación jurídica y financiera de Blue Label Technologies</w:t>
+        <w:t>Documentación jurídica y financiera de Blue Label Technologies — YA RECIBIDA</w:t>
       </w:r>
     </w:p>
     <w:p>
@@ -1049,7 +1096,7 @@
           <w:color w:val="42506B"/>
           <w:sz w:val="20"/>
         </w:rPr>
-        <w:t>El RUT, la Cámara de Comercio y los estados financieros que existen en el expediente corresponden a CYBERWARE S.A.S. (nombre comercial CPCYDESYS, NIT 901.052.986-8) — el establecimiento de comercio bajo el cual opera Cydesys. No existe ningún documento jurídico o financiero propio de Blue Label Technologies S.A.S.</w:t>
+        <w:t>Se recibieron: RUT, Cámara de Comercio, estados financieros 2025, certificación bancaria (Davivienda), certificado de Contraloría y de Procuraduría de la empresa y de su representante legal (Camilo Eduardo Gómez Uribe). Esto resuelve el vacío más crítico del checklist anterior.</w:t>
       </w:r>
     </w:p>
     <w:p>
@@ -1062,14 +1109,14 @@
           <w:color w:val="0B1220"/>
           <w:sz w:val="19"/>
         </w:rPr>
-        <w:t xml:space="preserve">Por qué es crítico: </w:t>
+        <w:t xml:space="preserve">Pendiente: </w:t>
       </w:r>
       <w:r>
         <w:rPr>
           <w:color w:val="42506B"/>
           <w:sz w:val="19"/>
         </w:rPr>
-        <w:t xml:space="preserve"> la ECI confirmó por escrito que, en una figura asociativa (Unión Temporal), los documentos jurídicos y financieros deben presentarse de forma independiente por cada integrante — no basta con los de Cydesys.</w:t>
+        <w:t xml:space="preserve"> el RUT fue emitido el 19 de mayo de 2026 y la Cámara de Comercio el mismo día — ambos con antigüedad mayor a la que probablemente exige el TdR (RUT vigente pero conviene reconfirmar el plazo exacto; Cámara de Comercio con límite de 30 días antes del cierre, ya vencida). Solicitar Cámara de Comercio actualizada y confirmar si el RUT necesita reexpedirse.</w:t>
       </w:r>
     </w:p>
     <w:p>
@@ -1082,14 +1129,34 @@
           <w:color w:val="0B1220"/>
           <w:sz w:val="19"/>
         </w:rPr>
-        <w:t xml:space="preserve">Acción: </w:t>
+        <w:t xml:space="preserve">Pendiente: </w:t>
       </w:r>
       <w:r>
         <w:rPr>
           <w:color w:val="42506B"/>
           <w:sz w:val="19"/>
         </w:rPr>
-        <w:t xml:space="preserve"> reunir y cargar RUT, Cámara de Comercio y estados financieros 2025 + intermedios 2026 de Blue Label Technologies S.A.S.</w:t>
+        <w:t xml:space="preserve"> el archivo de estados financieros no permitió leer el detalle numérico (tabla vacía en la conversión) — revisar el PDF original directamente y confirmar que incluya notas, firma del revisor fiscal (o la salvedad de exención por tamaño de empresa) y, si el TdR lo exige, los estados intermedios 2026.</w:t>
+      </w:r>
+    </w:p>
+    <w:p>
+      <w:pPr>
+        <w:pStyle w:val="ListBullet"/>
+      </w:pPr>
+      <w:r>
+        <w:rPr>
+          <w:b/>
+          <w:color w:val="0B1220"/>
+          <w:sz w:val="19"/>
+        </w:rPr>
+        <w:t xml:space="preserve">Pendiente: </w:t>
+      </w:r>
+      <w:r>
+        <w:rPr>
+          <w:color w:val="42506B"/>
+          <w:sz w:val="19"/>
+        </w:rPr>
+        <w:t xml:space="preserve"> el archivo de la cédula del representante legal llegó vacío — reenviar el escaneo o PDF original.</w:t>
       </w:r>
     </w:p>
     <w:p>
@@ -1118,7 +1185,7 @@
           <w:color w:val="0B1220"/>
           <w:sz w:val="25"/>
         </w:rPr>
-        <w:t>Cámara de Comercio de Cydesys — vigencia vencida</w:t>
+        <w:t>Cámara de Comercio — vigencia vencida (BLT y Cydesys)</w:t>
       </w:r>
     </w:p>
     <w:p>
@@ -1128,7 +1195,7 @@
           <w:color w:val="42506B"/>
           <w:sz w:val="20"/>
         </w:rPr>
-        <w:t>El certificado de Cámara de Comercio de Cyberware S.A.S. tiene fecha de expedición 11 de agosto de 2026. El TdR exige que este documento tenga máximo 30 días calendario de expedido respecto a la fecha límite de entrega (16 de septiembre de 2026) — a esa fecha el certificado tendría 36 días, fuera del límite permitido.</w:t>
+        <w:t>Tanto la Cámara de Comercio de Blue Label Technologies (expedida 19-may-2026) como la de Cydesys/Cyberware (expedida 11-ago-2026) exceden el límite de 30 días calendario antes de la fecha de cierre que exige el TdR (16-sep-2026).</w:t>
       </w:r>
     </w:p>
     <w:p>
@@ -1148,7 +1215,7 @@
           <w:color w:val="42506B"/>
           <w:sz w:val="19"/>
         </w:rPr>
-        <w:t xml:space="preserve"> solicitar a Cydesys un certificado de Cámara de Comercio actualizado, expedido dentro de los 30 días previos al 16 de septiembre.</w:t>
+        <w:t xml:space="preserve"> solicitar certificados de Cámara de Comercio actualizados para ambas empresas, expedidos dentro de los 30 días previos al cierre — este trámite es rápido (se puede generar el mismo día en línea) y debe hacerse lo más cerca posible de la fecha de radicación.</w:t>
       </w:r>
     </w:p>
     <w:p>
@@ -1177,7 +1244,7 @@
           <w:color w:val="0B1220"/>
           <w:sz w:val="25"/>
         </w:rPr>
-        <w:t>Estados financieros intermedios 2026</w:t>
+        <w:t>Certificados de experiencia y referencias comerciales — RESUELTO CON NOTA</w:t>
       </w:r>
     </w:p>
     <w:p>
@@ -1187,7 +1254,7 @@
           <w:color w:val="42506B"/>
           <w:sz w:val="20"/>
         </w:rPr>
-        <w:t>Solo se cuenta con los estados financieros individuales con corte a diciembre de 2025. El TdR exige adicionalmente estados financieros de prueba/intermedios con corte 2026, junto con notas y firma del revisor fiscal (o la salvedad legal correspondiente si la empresa está exceptuada por su tamaño).</w:t>
+        <w:t>Se recibieron tres cartas de referencia comercial de Blue Label Technologies: Medisinu IPS (relación desde sep-2024), Indigo Technologies (relación desde 2024, firewalls Fortigate NGFW y protección de endpoints) y Cydesys/Cyberware (relación desde 2024, endpoints especializados). Esto cumple el mínimo de 3 referencias de los últimos 2 años que exige el TdR.</w:t>
       </w:r>
     </w:p>
     <w:p>
@@ -1200,14 +1267,34 @@
           <w:color w:val="0B1220"/>
           <w:sz w:val="19"/>
         </w:rPr>
-        <w:t xml:space="preserve">Acción: </w:t>
+        <w:t xml:space="preserve">Nota importante: </w:t>
       </w:r>
       <w:r>
         <w:rPr>
           <w:color w:val="42506B"/>
           <w:sz w:val="19"/>
         </w:rPr>
-        <w:t xml:space="preserve"> solicitar a Cydesys (y preparar para Blue Label) los estados financieros intermedios 2026, con notas y certificación del revisor fiscal o la aclaración legal de exención.</w:t>
+        <w:t xml:space="preserve"> las tres referencias documentan experiencia en ciberseguridad (firewalls, endpoints) y no en virtualización/HCI/modernización de datacenter — el objeto específico del contrato ECI. Confirmar si el TdR exige que la experiencia sea del mismo tipo de proyecto o si basta con experiencia comercial general de la empresa; si exige coincidencia de alcance, conviene complementar con experiencia de Cydesys en implementaciones Sangfor/HCI específicamente.</w:t>
+      </w:r>
+    </w:p>
+    <w:p>
+      <w:pPr>
+        <w:pStyle w:val="ListBullet"/>
+      </w:pPr>
+      <w:r>
+        <w:rPr>
+          <w:b/>
+          <w:color w:val="0B1220"/>
+          <w:sz w:val="19"/>
+        </w:rPr>
+        <w:t xml:space="preserve">Nota: </w:t>
+      </w:r>
+      <w:r>
+        <w:rPr>
+          <w:color w:val="42506B"/>
+          <w:sz w:val="19"/>
+        </w:rPr>
+        <w:t xml:space="preserve"> ninguna de las tres cartas incluye el valor económico del contrato ni el alcance detallado que pide el TdR (objeto, alcance, valor, fecha de ejecución) — son cartas de recomendación genéricas, no certificaciones de experiencia en el formato específico. Evaluar si hay que pedir un formato más detallado a estos mismos clientes.</w:t>
       </w:r>
     </w:p>
     <w:p>
@@ -1236,7 +1323,7 @@
           <w:color w:val="0B1220"/>
           <w:sz w:val="25"/>
         </w:rPr>
-        <w:t>Anexo 5/6 — Compromiso de Integridad y Anticorrupción</w:t>
+        <w:t>Compromiso de Integridad y Anticorrupción — Anexo 5/6</w:t>
       </w:r>
     </w:p>
     <w:p>
@@ -1246,7 +1333,7 @@
           <w:color w:val="42506B"/>
           <w:sz w:val="20"/>
         </w:rPr>
-        <w:t>El documento existe en el expediente pero como plantilla en blanco: sin diligenciar, sin firma del representante legal ni fecha. Es una declaración obligatoria (compromiso anticorrupción, prevención interna, canales de denuncia, protección a denunciantes) que debe entregarse firmada bajo gravedad de juramento.</w:t>
+        <w:t>El documento existe en el expediente pero como plantilla en blanco: sin diligenciar, sin firma del representante legal ni fecha.</w:t>
       </w:r>
     </w:p>
     <w:p>
@@ -1354,65 +1441,6 @@
           <w:color w:val="0B1220"/>
           <w:sz w:val="25"/>
         </w:rPr>
-        <w:t>Certificados de experiencia y referencias comerciales</w:t>
-      </w:r>
-    </w:p>
-    <w:p>
-      <w:r>
-        <w:rPr>
-          <w:i w:val="0"/>
-          <w:color w:val="42506B"/>
-          <w:sz w:val="20"/>
-        </w:rPr>
-        <w:t>El TdR exige certificar experiencia en implementaciones similares: objeto del contrato, alcance, valor, fecha de ejecución, y mínimo tres referencias comerciales de los últimos dos años con datos de contacto verificables. No hay una sola certificación de experiencia, listado de proyectos o carta de recomendación en el expediente, ni de Cydesys/Cyberware ni de Blue Label.</w:t>
-      </w:r>
-    </w:p>
-    <w:p>
-      <w:pPr>
-        <w:pStyle w:val="ListBullet"/>
-      </w:pPr>
-      <w:r>
-        <w:rPr>
-          <w:b/>
-          <w:color w:val="0B1220"/>
-          <w:sz w:val="19"/>
-        </w:rPr>
-        <w:t xml:space="preserve">Acción: </w:t>
-      </w:r>
-      <w:r>
-        <w:rPr>
-          <w:color w:val="42506B"/>
-          <w:sz w:val="19"/>
-        </w:rPr>
-        <w:t xml:space="preserve"> recopilar mínimo 3 certificaciones/cartas de referencia de clientes de los últimos 2 años (Cydesys y/o BLT) que respalden implementaciones similares de virtualización/HCI.</w:t>
-      </w:r>
-    </w:p>
-    <w:p>
-      <w:pPr>
-        <w:spacing w:before="40" w:after="200"/>
-        <w:pBdr>
-          <w:bottom w:val="single" w:sz="6" w:space="1" w:color="DCE6F5"/>
-        </w:pBdr>
-      </w:pPr>
-    </w:p>
-    <w:p>
-      <w:pPr>
-        <w:pStyle w:val="Heading2"/>
-      </w:pPr>
-      <w:r>
-        <w:rPr>
-          <w:b/>
-          <w:color w:val="0B5ED7"/>
-          <w:sz w:val="25"/>
-        </w:rPr>
-        <w:t xml:space="preserve">7  </w:t>
-      </w:r>
-      <w:r>
-        <w:rPr>
-          <w:b/>
-          <w:color w:val="0B1220"/>
-          <w:sz w:val="25"/>
-        </w:rPr>
         <w:t>Carta de aval del fabricante</w:t>
       </w:r>
     </w:p>
@@ -1464,7 +1492,7 @@
           <w:color w:val="0B5ED7"/>
           <w:sz w:val="25"/>
         </w:rPr>
-        <w:t xml:space="preserve">8  </w:t>
+        <w:t xml:space="preserve">7  </w:t>
       </w:r>
       <w:r>
         <w:rPr>
@@ -1523,7 +1551,7 @@
           <w:color w:val="0B5ED7"/>
           <w:sz w:val="25"/>
         </w:rPr>
-        <w:t xml:space="preserve">9  </w:t>
+        <w:t xml:space="preserve">8  </w:t>
       </w:r>
       <w:r>
         <w:rPr>
@@ -1541,7 +1569,7 @@
           <w:color w:val="42506B"/>
           <w:sz w:val="20"/>
         </w:rPr>
-        <w:t>Ambos anexos existen en el expediente únicamente como plantillas vacías. El contenido técnico para el Anexo 4 ya existe (arquitectura, cumplimiento punto por punto) — solo falta transcribirlo al formato oficial, lo cual conviene tener listo para el 7-sep aunque el TdR no lo pida explícitamente ese día. El Anexo 2 requiere las cifras de TCO, que dependen de la opción de hardware finalmente elegida — aplica al 16-sep.</w:t>
+        <w:t>Ambos anexos existen en el expediente únicamente como plantillas vacías. El contenido técnico para el Anexo 4 ya existe — solo falta transcribirlo al formato oficial, lo cual conviene tener listo para el 7-sep. El Anexo 2 requiere las cifras de TCO, que dependen de la opción de hardware finalmente elegida — aplica al 16-sep.</w:t>
       </w:r>
     </w:p>
     <w:p>
@@ -1664,6 +1692,30 @@
           <w:sz w:val="19"/>
         </w:rPr>
         <w:t>Recomendación técnica clara y documentada entre las dos rutas de hardware (HPE sin riesgo vs. Dell con riesgo de cumplimiento).</w:t>
+      </w:r>
+    </w:p>
+    <w:p>
+      <w:pPr>
+        <w:pStyle w:val="ListBullet"/>
+      </w:pPr>
+      <w:r>
+        <w:rPr>
+          <w:color w:val="42506B"/>
+          <w:sz w:val="19"/>
+        </w:rPr>
+        <w:t>RUT, Cámara de Comercio, estados financieros, certificación bancaria y certificados de Contraloría/Procuraduría de Blue Label Technologies y su representante legal recibidos.</w:t>
+      </w:r>
+    </w:p>
+    <w:p>
+      <w:pPr>
+        <w:pStyle w:val="ListBullet"/>
+      </w:pPr>
+      <w:r>
+        <w:rPr>
+          <w:color w:val="42506B"/>
+          <w:sz w:val="19"/>
+        </w:rPr>
+        <w:t>Tres cartas de experiencia comercial de Blue Label Technologies (Medisinu, Indigo Technologies, Cydesys/Cyberware) — cumple el mínimo de 3 referencias.</w:t>
       </w:r>
     </w:p>
     <w:p/>

</xml_diff>